<commit_message>
Sprint 1: Basic UI + Package Refactoring + Functional Navbar
</commit_message>
<xml_diff>
--- a/GithubLink.docx
+++ b/GithubLink.docx
@@ -12,7 +12,6 @@
           <w:lang w:val="en-US"/>
         </w:rPr>
       </w:pPr>
-      <w:proofErr w:type="spellStart"/>
       <w:r>
         <w:rPr>
           <w:b/>
@@ -22,7 +21,6 @@
         </w:rPr>
         <w:t>TUSMindSpace</w:t>
       </w:r>
-      <w:proofErr w:type="spellEnd"/>
       <w:r>
         <w:rPr>
           <w:b/>
@@ -46,23 +44,13 @@
           <w:lang w:val="en-US"/>
         </w:rPr>
       </w:pPr>
-      <w:proofErr w:type="spellStart"/>
       <w:r>
         <w:rPr>
           <w:b/>
           <w:bCs/>
           <w:lang w:val="en-US"/>
         </w:rPr>
-        <w:t>Github</w:t>
-      </w:r>
-      <w:proofErr w:type="spellEnd"/>
-      <w:r>
-        <w:rPr>
-          <w:b/>
-          <w:bCs/>
-          <w:lang w:val="en-US"/>
-        </w:rPr>
-        <w:t xml:space="preserve"> link:</w:t>
+        <w:t>Github link:</w:t>
       </w:r>
       <w:r>
         <w:rPr>
@@ -70,12 +58,669 @@
         </w:rPr>
         <w:t xml:space="preserve"> </w:t>
       </w:r>
+      <w:hyperlink r:id="rId4" w:history="1">
+        <w:r>
+          <w:rPr>
+            <w:rStyle w:val="Hyperlink"/>
+            <w:lang w:val="en-US"/>
+          </w:rPr>
+          <w:t>https://github.com/MAD2IK/TUSMindSpace</w:t>
+        </w:r>
+      </w:hyperlink>
+    </w:p>
+    <w:p>
+      <w:pPr>
+        <w:pStyle w:val="Title"/>
+        <w:rPr>
+          <w:b/>
+          <w:bCs/>
+          <w:u w:val="single"/>
+          <w:lang w:val="en-US"/>
+        </w:rPr>
+      </w:pPr>
+      <w:r>
+        <w:rPr>
+          <w:b/>
+          <w:bCs/>
+          <w:u w:val="single"/>
+          <w:lang w:val="en-US"/>
+        </w:rPr>
+        <w:t>Current Progress</w:t>
+      </w:r>
+    </w:p>
+    <w:p>
+      <w:pPr>
+        <w:rPr>
+          <w:lang w:val="en-US"/>
+        </w:rPr>
+      </w:pPr>
       <w:r>
         <w:rPr>
           <w:lang w:val="en-US"/>
         </w:rPr>
-        <w:t>https://github.com/MAD2IK/TUSMindSpace</w:t>
+        <w:t>As of 29/10/2026, current progress for Sprint 1 has been completed as follows:</w:t>
       </w:r>
+    </w:p>
+    <w:tbl>
+      <w:tblPr>
+        <w:tblStyle w:val="TableGrid"/>
+        <w:tblW w:w="0" w:type="auto"/>
+        <w:tblLook w:val="04A0" w:firstRow="1" w:lastRow="0" w:firstColumn="1" w:lastColumn="0" w:noHBand="0" w:noVBand="1"/>
+      </w:tblPr>
+      <w:tblGrid>
+        <w:gridCol w:w="3005"/>
+        <w:gridCol w:w="3005"/>
+        <w:gridCol w:w="3006"/>
+      </w:tblGrid>
+      <w:tr>
+        <w:tc>
+          <w:tcPr>
+            <w:tcW w:w="3005" w:type="dxa"/>
+            <w:shd w:val="clear" w:color="auto" w:fill="D1D1D1" w:themeFill="background2" w:themeFillShade="E6"/>
+          </w:tcPr>
+          <w:p>
+            <w:pPr>
+              <w:rPr>
+                <w:b/>
+                <w:bCs/>
+                <w:lang w:val="en-US"/>
+              </w:rPr>
+            </w:pPr>
+            <w:r>
+              <w:rPr>
+                <w:b/>
+                <w:bCs/>
+                <w:lang w:val="en-US"/>
+              </w:rPr>
+              <w:t>Week</w:t>
+            </w:r>
+          </w:p>
+        </w:tc>
+        <w:tc>
+          <w:tcPr>
+            <w:tcW w:w="3005" w:type="dxa"/>
+            <w:shd w:val="clear" w:color="auto" w:fill="D1D1D1" w:themeFill="background2" w:themeFillShade="E6"/>
+          </w:tcPr>
+          <w:p>
+            <w:pPr>
+              <w:rPr>
+                <w:b/>
+                <w:bCs/>
+                <w:lang w:val="en-US"/>
+              </w:rPr>
+            </w:pPr>
+            <w:r>
+              <w:rPr>
+                <w:b/>
+                <w:bCs/>
+                <w:lang w:val="en-US"/>
+              </w:rPr>
+              <w:t>Item</w:t>
+            </w:r>
+          </w:p>
+        </w:tc>
+        <w:tc>
+          <w:tcPr>
+            <w:tcW w:w="3006" w:type="dxa"/>
+            <w:shd w:val="clear" w:color="auto" w:fill="D1D1D1" w:themeFill="background2" w:themeFillShade="E6"/>
+          </w:tcPr>
+          <w:p>
+            <w:pPr>
+              <w:rPr>
+                <w:b/>
+                <w:bCs/>
+                <w:lang w:val="en-US"/>
+              </w:rPr>
+            </w:pPr>
+            <w:r>
+              <w:rPr>
+                <w:b/>
+                <w:bCs/>
+                <w:lang w:val="en-US"/>
+              </w:rPr>
+              <w:t>Status</w:t>
+            </w:r>
+          </w:p>
+        </w:tc>
+      </w:tr>
+      <w:tr>
+        <w:tc>
+          <w:tcPr>
+            <w:tcW w:w="3005" w:type="dxa"/>
+            <w:shd w:val="clear" w:color="auto" w:fill="FFFFFF" w:themeFill="background1"/>
+          </w:tcPr>
+          <w:p>
+            <w:pPr>
+              <w:rPr>
+                <w:lang w:val="en-US"/>
+              </w:rPr>
+            </w:pPr>
+            <w:r>
+              <w:rPr>
+                <w:lang w:val="en-US"/>
+              </w:rPr>
+              <w:t>Week 1</w:t>
+            </w:r>
+          </w:p>
+        </w:tc>
+        <w:tc>
+          <w:tcPr>
+            <w:tcW w:w="3005" w:type="dxa"/>
+            <w:shd w:val="clear" w:color="auto" w:fill="FFFFFF" w:themeFill="background1"/>
+          </w:tcPr>
+          <w:p>
+            <w:pPr>
+              <w:rPr>
+                <w:lang w:val="en-US"/>
+              </w:rPr>
+            </w:pPr>
+            <w:r>
+              <w:rPr>
+                <w:lang w:val="en-US"/>
+              </w:rPr>
+              <w:t>Proposal Draft</w:t>
+            </w:r>
+          </w:p>
+        </w:tc>
+        <w:tc>
+          <w:tcPr>
+            <w:tcW w:w="3006" w:type="dxa"/>
+            <w:shd w:val="clear" w:color="auto" w:fill="FFFFFF" w:themeFill="background1"/>
+          </w:tcPr>
+          <w:p>
+            <w:pPr>
+              <w:rPr>
+                <w:lang w:val="en-US"/>
+              </w:rPr>
+            </w:pPr>
+            <w:r>
+              <w:rPr>
+                <w:lang w:val="en-US"/>
+              </w:rPr>
+              <w:t>Done</w:t>
+            </w:r>
+          </w:p>
+        </w:tc>
+      </w:tr>
+      <w:tr>
+        <w:tc>
+          <w:tcPr>
+            <w:tcW w:w="3005" w:type="dxa"/>
+            <w:shd w:val="clear" w:color="auto" w:fill="FFFFFF" w:themeFill="background1"/>
+          </w:tcPr>
+          <w:p>
+            <w:pPr>
+              <w:rPr>
+                <w:lang w:val="en-US"/>
+              </w:rPr>
+            </w:pPr>
+            <w:r>
+              <w:rPr>
+                <w:lang w:val="en-US"/>
+              </w:rPr>
+              <w:t>Week 1</w:t>
+            </w:r>
+          </w:p>
+        </w:tc>
+        <w:tc>
+          <w:tcPr>
+            <w:tcW w:w="3005" w:type="dxa"/>
+            <w:shd w:val="clear" w:color="auto" w:fill="FFFFFF" w:themeFill="background1"/>
+          </w:tcPr>
+          <w:p>
+            <w:pPr>
+              <w:rPr>
+                <w:lang w:val="en-US"/>
+              </w:rPr>
+            </w:pPr>
+            <w:r>
+              <w:rPr>
+                <w:lang w:val="en-US"/>
+              </w:rPr>
+              <w:t>Github Repo</w:t>
+            </w:r>
+          </w:p>
+        </w:tc>
+        <w:tc>
+          <w:tcPr>
+            <w:tcW w:w="3006" w:type="dxa"/>
+            <w:shd w:val="clear" w:color="auto" w:fill="FFFFFF" w:themeFill="background1"/>
+          </w:tcPr>
+          <w:p>
+            <w:pPr>
+              <w:rPr>
+                <w:lang w:val="en-US"/>
+              </w:rPr>
+            </w:pPr>
+            <w:r>
+              <w:rPr>
+                <w:lang w:val="en-US"/>
+              </w:rPr>
+              <w:t>Done</w:t>
+            </w:r>
+          </w:p>
+        </w:tc>
+      </w:tr>
+      <w:tr>
+        <w:tc>
+          <w:tcPr>
+            <w:tcW w:w="3005" w:type="dxa"/>
+            <w:shd w:val="clear" w:color="auto" w:fill="FFFFFF" w:themeFill="background1"/>
+          </w:tcPr>
+          <w:p>
+            <w:pPr>
+              <w:rPr>
+                <w:lang w:val="en-US"/>
+              </w:rPr>
+            </w:pPr>
+            <w:r>
+              <w:rPr>
+                <w:lang w:val="en-US"/>
+              </w:rPr>
+              <w:t>Week 1</w:t>
+            </w:r>
+          </w:p>
+        </w:tc>
+        <w:tc>
+          <w:tcPr>
+            <w:tcW w:w="3005" w:type="dxa"/>
+            <w:shd w:val="clear" w:color="auto" w:fill="FFFFFF" w:themeFill="background1"/>
+          </w:tcPr>
+          <w:p>
+            <w:pPr>
+              <w:rPr>
+                <w:lang w:val="en-US"/>
+              </w:rPr>
+            </w:pPr>
+            <w:r>
+              <w:rPr>
+                <w:lang w:val="en-US"/>
+              </w:rPr>
+              <w:t>Readme.md Draft</w:t>
+            </w:r>
+          </w:p>
+        </w:tc>
+        <w:tc>
+          <w:tcPr>
+            <w:tcW w:w="3006" w:type="dxa"/>
+            <w:shd w:val="clear" w:color="auto" w:fill="FFFFFF" w:themeFill="background1"/>
+          </w:tcPr>
+          <w:p>
+            <w:pPr>
+              <w:rPr>
+                <w:lang w:val="en-US"/>
+              </w:rPr>
+            </w:pPr>
+            <w:r>
+              <w:rPr>
+                <w:lang w:val="en-US"/>
+              </w:rPr>
+              <w:t>Done</w:t>
+            </w:r>
+          </w:p>
+        </w:tc>
+      </w:tr>
+      <w:tr>
+        <w:tc>
+          <w:tcPr>
+            <w:tcW w:w="3005" w:type="dxa"/>
+            <w:shd w:val="clear" w:color="auto" w:fill="FFFFFF" w:themeFill="background1"/>
+          </w:tcPr>
+          <w:p>
+            <w:pPr>
+              <w:rPr>
+                <w:lang w:val="en-US"/>
+              </w:rPr>
+            </w:pPr>
+            <w:r>
+              <w:rPr>
+                <w:lang w:val="en-US"/>
+              </w:rPr>
+              <w:t>Week 2</w:t>
+            </w:r>
+          </w:p>
+        </w:tc>
+        <w:tc>
+          <w:tcPr>
+            <w:tcW w:w="3005" w:type="dxa"/>
+            <w:shd w:val="clear" w:color="auto" w:fill="FFFFFF" w:themeFill="background1"/>
+          </w:tcPr>
+          <w:p>
+            <w:pPr>
+              <w:rPr>
+                <w:lang w:val="en-US"/>
+              </w:rPr>
+            </w:pPr>
+            <w:r>
+              <w:rPr>
+                <w:lang w:val="en-US"/>
+              </w:rPr>
+              <w:t>Low fidelity wireframes</w:t>
+            </w:r>
+          </w:p>
+        </w:tc>
+        <w:tc>
+          <w:tcPr>
+            <w:tcW w:w="3006" w:type="dxa"/>
+            <w:shd w:val="clear" w:color="auto" w:fill="FFFFFF" w:themeFill="background1"/>
+          </w:tcPr>
+          <w:p>
+            <w:pPr>
+              <w:rPr>
+                <w:lang w:val="en-US"/>
+              </w:rPr>
+            </w:pPr>
+            <w:r>
+              <w:rPr>
+                <w:lang w:val="en-US"/>
+              </w:rPr>
+              <w:t>Done</w:t>
+            </w:r>
+          </w:p>
+        </w:tc>
+      </w:tr>
+      <w:tr>
+        <w:tc>
+          <w:tcPr>
+            <w:tcW w:w="3005" w:type="dxa"/>
+            <w:shd w:val="clear" w:color="auto" w:fill="FFFFFF" w:themeFill="background1"/>
+          </w:tcPr>
+          <w:p>
+            <w:pPr>
+              <w:rPr>
+                <w:lang w:val="en-US"/>
+              </w:rPr>
+            </w:pPr>
+            <w:r>
+              <w:rPr>
+                <w:lang w:val="en-US"/>
+              </w:rPr>
+              <w:t>Week 2</w:t>
+            </w:r>
+          </w:p>
+        </w:tc>
+        <w:tc>
+          <w:tcPr>
+            <w:tcW w:w="3005" w:type="dxa"/>
+            <w:shd w:val="clear" w:color="auto" w:fill="FFFFFF" w:themeFill="background1"/>
+          </w:tcPr>
+          <w:p>
+            <w:pPr>
+              <w:rPr>
+                <w:lang w:val="en-US"/>
+              </w:rPr>
+            </w:pPr>
+            <w:r>
+              <w:rPr>
+                <w:lang w:val="en-US"/>
+              </w:rPr>
+              <w:t>Home Screen UI</w:t>
+            </w:r>
+          </w:p>
+        </w:tc>
+        <w:tc>
+          <w:tcPr>
+            <w:tcW w:w="3006" w:type="dxa"/>
+            <w:shd w:val="clear" w:color="auto" w:fill="FFFFFF" w:themeFill="background1"/>
+          </w:tcPr>
+          <w:p>
+            <w:pPr>
+              <w:rPr>
+                <w:lang w:val="en-US"/>
+              </w:rPr>
+            </w:pPr>
+            <w:r>
+              <w:rPr>
+                <w:lang w:val="en-US"/>
+              </w:rPr>
+              <w:t>Done</w:t>
+            </w:r>
+          </w:p>
+        </w:tc>
+      </w:tr>
+      <w:tr>
+        <w:tc>
+          <w:tcPr>
+            <w:tcW w:w="3005" w:type="dxa"/>
+            <w:shd w:val="clear" w:color="auto" w:fill="FFFFFF" w:themeFill="background1"/>
+          </w:tcPr>
+          <w:p>
+            <w:pPr>
+              <w:rPr>
+                <w:lang w:val="en-US"/>
+              </w:rPr>
+            </w:pPr>
+            <w:r>
+              <w:rPr>
+                <w:lang w:val="en-US"/>
+              </w:rPr>
+              <w:t>Week 2</w:t>
+            </w:r>
+          </w:p>
+        </w:tc>
+        <w:tc>
+          <w:tcPr>
+            <w:tcW w:w="3005" w:type="dxa"/>
+            <w:shd w:val="clear" w:color="auto" w:fill="FFFFFF" w:themeFill="background1"/>
+          </w:tcPr>
+          <w:p>
+            <w:pPr>
+              <w:rPr>
+                <w:lang w:val="en-US"/>
+              </w:rPr>
+            </w:pPr>
+            <w:r>
+              <w:rPr>
+                <w:lang w:val="en-US"/>
+              </w:rPr>
+              <w:t>Navigation UI</w:t>
+            </w:r>
+          </w:p>
+        </w:tc>
+        <w:tc>
+          <w:tcPr>
+            <w:tcW w:w="3006" w:type="dxa"/>
+            <w:shd w:val="clear" w:color="auto" w:fill="FFFFFF" w:themeFill="background1"/>
+          </w:tcPr>
+          <w:p>
+            <w:pPr>
+              <w:rPr>
+                <w:lang w:val="en-US"/>
+              </w:rPr>
+            </w:pPr>
+            <w:r>
+              <w:rPr>
+                <w:lang w:val="en-US"/>
+              </w:rPr>
+              <w:t>Done</w:t>
+            </w:r>
+          </w:p>
+        </w:tc>
+      </w:tr>
+      <w:tr>
+        <w:tc>
+          <w:tcPr>
+            <w:tcW w:w="3005" w:type="dxa"/>
+            <w:shd w:val="clear" w:color="auto" w:fill="FFFFFF" w:themeFill="background1"/>
+          </w:tcPr>
+          <w:p>
+            <w:pPr>
+              <w:rPr>
+                <w:lang w:val="en-US"/>
+              </w:rPr>
+            </w:pPr>
+            <w:r>
+              <w:rPr>
+                <w:lang w:val="en-US"/>
+              </w:rPr>
+              <w:t>Week 2</w:t>
+            </w:r>
+          </w:p>
+        </w:tc>
+        <w:tc>
+          <w:tcPr>
+            <w:tcW w:w="3005" w:type="dxa"/>
+            <w:shd w:val="clear" w:color="auto" w:fill="FFFFFF" w:themeFill="background1"/>
+          </w:tcPr>
+          <w:p>
+            <w:pPr>
+              <w:rPr>
+                <w:lang w:val="en-US"/>
+              </w:rPr>
+            </w:pPr>
+            <w:r>
+              <w:rPr>
+                <w:lang w:val="en-US"/>
+              </w:rPr>
+              <w:t>Meditate Screen UI</w:t>
+            </w:r>
+          </w:p>
+        </w:tc>
+        <w:tc>
+          <w:tcPr>
+            <w:tcW w:w="3006" w:type="dxa"/>
+            <w:shd w:val="clear" w:color="auto" w:fill="FFFFFF" w:themeFill="background1"/>
+          </w:tcPr>
+          <w:p>
+            <w:pPr>
+              <w:rPr>
+                <w:lang w:val="en-US"/>
+              </w:rPr>
+            </w:pPr>
+            <w:r>
+              <w:rPr>
+                <w:lang w:val="en-US"/>
+              </w:rPr>
+              <w:t>WIP</w:t>
+            </w:r>
+          </w:p>
+        </w:tc>
+      </w:tr>
+      <w:tr>
+        <w:tc>
+          <w:tcPr>
+            <w:tcW w:w="3005" w:type="dxa"/>
+            <w:shd w:val="clear" w:color="auto" w:fill="FFFFFF" w:themeFill="background1"/>
+          </w:tcPr>
+          <w:p>
+            <w:pPr>
+              <w:rPr>
+                <w:lang w:val="en-US"/>
+              </w:rPr>
+            </w:pPr>
+            <w:r>
+              <w:rPr>
+                <w:lang w:val="en-US"/>
+              </w:rPr>
+              <w:t>Week 2</w:t>
+            </w:r>
+          </w:p>
+        </w:tc>
+        <w:tc>
+          <w:tcPr>
+            <w:tcW w:w="3005" w:type="dxa"/>
+            <w:shd w:val="clear" w:color="auto" w:fill="FFFFFF" w:themeFill="background1"/>
+          </w:tcPr>
+          <w:p>
+            <w:pPr>
+              <w:rPr>
+                <w:lang w:val="en-US"/>
+              </w:rPr>
+            </w:pPr>
+            <w:r>
+              <w:rPr>
+                <w:lang w:val="en-US"/>
+              </w:rPr>
+              <w:t>Journal, Resources, Contact Screen</w:t>
+            </w:r>
+          </w:p>
+        </w:tc>
+        <w:tc>
+          <w:tcPr>
+            <w:tcW w:w="3006" w:type="dxa"/>
+            <w:shd w:val="clear" w:color="auto" w:fill="FFFFFF" w:themeFill="background1"/>
+          </w:tcPr>
+          <w:p>
+            <w:pPr>
+              <w:rPr>
+                <w:lang w:val="en-US"/>
+              </w:rPr>
+            </w:pPr>
+            <w:r>
+              <w:rPr>
+                <w:lang w:val="en-US"/>
+              </w:rPr>
+              <w:t>WIP (Placeholder title screens only)</w:t>
+            </w:r>
+          </w:p>
+        </w:tc>
+      </w:tr>
+      <w:tr>
+        <w:tc>
+          <w:tcPr>
+            <w:tcW w:w="3005" w:type="dxa"/>
+            <w:shd w:val="clear" w:color="auto" w:fill="FFFFFF" w:themeFill="background1"/>
+          </w:tcPr>
+          <w:p>
+            <w:pPr>
+              <w:rPr>
+                <w:lang w:val="en-US"/>
+              </w:rPr>
+            </w:pPr>
+            <w:r>
+              <w:rPr>
+                <w:lang w:val="en-US"/>
+              </w:rPr>
+              <w:t>Week 3</w:t>
+            </w:r>
+          </w:p>
+        </w:tc>
+        <w:tc>
+          <w:tcPr>
+            <w:tcW w:w="3005" w:type="dxa"/>
+            <w:shd w:val="clear" w:color="auto" w:fill="FFFFFF" w:themeFill="background1"/>
+          </w:tcPr>
+          <w:p>
+            <w:pPr>
+              <w:rPr>
+                <w:lang w:val="en-US"/>
+              </w:rPr>
+            </w:pPr>
+            <w:r>
+              <w:rPr>
+                <w:lang w:val="en-US"/>
+              </w:rPr>
+              <w:t>WIP</w:t>
+            </w:r>
+          </w:p>
+        </w:tc>
+        <w:tc>
+          <w:tcPr>
+            <w:tcW w:w="3006" w:type="dxa"/>
+            <w:shd w:val="clear" w:color="auto" w:fill="FFFFFF" w:themeFill="background1"/>
+          </w:tcPr>
+          <w:p>
+            <w:pPr>
+              <w:rPr>
+                <w:lang w:val="en-US"/>
+              </w:rPr>
+            </w:pPr>
+            <w:r>
+              <w:rPr>
+                <w:lang w:val="en-US"/>
+              </w:rPr>
+              <w:t>WIP</w:t>
+            </w:r>
+          </w:p>
+        </w:tc>
+      </w:tr>
+    </w:tbl>
+    <w:p>
+      <w:pPr>
+        <w:rPr>
+          <w:lang w:val="en-US"/>
+        </w:rPr>
+      </w:pPr>
     </w:p>
     <w:sectPr>
       <w:pgSz w:w="11906" w:h="16838"/>
@@ -1004,6 +1649,48 @@
       <w:spacing w:val="5"/>
     </w:rPr>
   </w:style>
+  <w:style w:type="character" w:styleId="Hyperlink">
+    <w:name w:val="Hyperlink"/>
+    <w:basedOn w:val="DefaultParagraphFont"/>
+    <w:uiPriority w:val="99"/>
+    <w:unhideWhenUsed/>
+    <w:rsid w:val="00742E2B"/>
+    <w:rPr>
+      <w:color w:val="467886" w:themeColor="hyperlink"/>
+      <w:u w:val="single"/>
+    </w:rPr>
+  </w:style>
+  <w:style w:type="character" w:styleId="UnresolvedMention">
+    <w:name w:val="Unresolved Mention"/>
+    <w:basedOn w:val="DefaultParagraphFont"/>
+    <w:uiPriority w:val="99"/>
+    <w:semiHidden/>
+    <w:unhideWhenUsed/>
+    <w:rsid w:val="00742E2B"/>
+    <w:rPr>
+      <w:color w:val="605E5C"/>
+      <w:shd w:val="clear" w:color="auto" w:fill="E1DFDD"/>
+    </w:rPr>
+  </w:style>
+  <w:style w:type="table" w:styleId="TableGrid">
+    <w:name w:val="Table Grid"/>
+    <w:basedOn w:val="TableNormal"/>
+    <w:uiPriority w:val="39"/>
+    <w:rsid w:val="00742E2B"/>
+    <w:pPr>
+      <w:spacing w:after="0" w:line="240" w:lineRule="auto"/>
+    </w:pPr>
+    <w:tblPr>
+      <w:tblBorders>
+        <w:top w:val="single" w:sz="4" w:space="0" w:color="auto"/>
+        <w:left w:val="single" w:sz="4" w:space="0" w:color="auto"/>
+        <w:bottom w:val="single" w:sz="4" w:space="0" w:color="auto"/>
+        <w:right w:val="single" w:sz="4" w:space="0" w:color="auto"/>
+        <w:insideH w:val="single" w:sz="4" w:space="0" w:color="auto"/>
+        <w:insideV w:val="single" w:sz="4" w:space="0" w:color="auto"/>
+      </w:tblBorders>
+    </w:tblPr>
+  </w:style>
 </w:styles>
 </file>
 

</xml_diff>